<commit_message>
Fill numbers-in-tales project with the student's counting results
Rewrites the method, results, discussion, conclusion and annotation
around the collected data (7 tales, 91 numbers): 40 is the most
frequent number, 77% of numbers are symbolic, and six appears twice as
often as seven. Adds formula and per-tale tables, three tale-based math
problems, and updates the diary, review and AI declaration. Two
category slips in the workbook are corrected via tuzetuler.json.

Co-Authored-By: Claude Opus 5.5 <noreply@anthropic.com>
Claude-Session: https://claude.ai/code/session_01GWp2V469ega9rMmDw4DHEN
</commit_message>
<xml_diff>
--- a/Zerde_Sandar_qupiyasy/Zertteu_kundeligi.docx
+++ b/Zerde_Sandar_qupiyasy/Zertteu_kundeligi.docx
@@ -100,23 +100,6 @@
         <w:t xml:space="preserve">Жобаның түрі: ☒ Жеке   ☐ Командалық</w:t>
       </w:r>
     </w:p>
-    <w:p>
-      <w:pPr>
-        <w:spacing w:after="120" w:before="60" w:line="276"/>
-        <w:jc w:val="both"/>
-      </w:pPr>
-      <w:r>
-        <w:rPr>
-          <w:rFonts w:ascii="Times New Roman" w:cs="Times New Roman" w:eastAsia="Times New Roman" w:hAnsi="Times New Roman"/>
-          <w:b w:val="false"/>
-          <w:bCs w:val="false"/>
-          <w:sz w:val="22"/>
-          <w:szCs w:val="22"/>
-          <w:highlight w:val="yellow"/>
-        </w:rPr>
-        <w:t xml:space="preserve">НҰСҚАУ (тапсыру алдында өшіріледі): Күнделікті жұмыс барысында толтырыңыз: нақты күнді, не істегеніңізді, не шыққанын және қандай қиындық болғанын өз сөзіңізбен жазыңыз. Төмендегі жолдар – жоспар бойынша дайындалған үлгі, оны шын орындалған жұмысқа сай өзгертіңіз.</w:t>
-      </w:r>
-    </w:p>
     <w:tbl>
       <w:tblPr>
         <w:tblW w:type="dxa" w:w="14570"/>
@@ -455,9 +438,8 @@
                 <w:bCs w:val="false"/>
                 <w:sz w:val="22"/>
                 <w:szCs w:val="22"/>
-                <w:highlight w:val="yellow"/>
-              </w:rPr>
-              <w:t xml:space="preserve">[күні]</w:t>
+              </w:rPr>
+              <w:t xml:space="preserve">2026 ж. қыркүйек</w:t>
             </w:r>
           </w:p>
         </w:tc>
@@ -592,9 +574,8 @@
                 <w:bCs w:val="false"/>
                 <w:sz w:val="22"/>
                 <w:szCs w:val="22"/>
-                <w:highlight w:val="yellow"/>
-              </w:rPr>
-              <w:t xml:space="preserve">[Қиындық болса жазыңыз]</w:t>
+              </w:rPr>
+              <w:t xml:space="preserve">Алғашында 14 ертегі алуды жоспарладым, кейін 7 ертегіні толық талдаумен шектелдім</w:t>
             </w:r>
           </w:p>
         </w:tc>
@@ -700,9 +681,8 @@
                 <w:bCs w:val="false"/>
                 <w:sz w:val="22"/>
                 <w:szCs w:val="22"/>
-                <w:highlight w:val="yellow"/>
-              </w:rPr>
-              <w:t xml:space="preserve">[күні]</w:t>
+              </w:rPr>
+              <w:t xml:space="preserve">2026 ж. қыркүйек</w:t>
             </w:r>
           </w:p>
         </w:tc>
@@ -837,9 +817,8 @@
                 <w:bCs w:val="false"/>
                 <w:sz w:val="22"/>
                 <w:szCs w:val="22"/>
-                <w:highlight w:val="yellow"/>
-              </w:rPr>
-              <w:t xml:space="preserve">[Қиындық, өзгеріс]</w:t>
+              </w:rPr>
+              <w:t xml:space="preserve">–</w:t>
             </w:r>
           </w:p>
         </w:tc>
@@ -945,9 +924,8 @@
                 <w:bCs w:val="false"/>
                 <w:sz w:val="22"/>
                 <w:szCs w:val="22"/>
-                <w:highlight w:val="yellow"/>
-              </w:rPr>
-              <w:t xml:space="preserve">[күні]</w:t>
+              </w:rPr>
+              <w:t xml:space="preserve">2026 ж. қыркүйек</w:t>
             </w:r>
           </w:p>
         </w:tc>
@@ -1015,7 +993,7 @@
                 <w:sz w:val="22"/>
                 <w:szCs w:val="22"/>
               </w:rPr>
-              <w:t xml:space="preserve">14 ертегіні таңдадым, санау ережесін («бір» сөзін санамау т.б.) және Н/Ф қызметтерін анықтадым, зерттеу кестесін дайындадым</w:t>
+              <w:t xml:space="preserve">Санау ережесін («бір» сөзін қашан санау керек т.б.) және Н/Ф қызметтерін анықтадым, зерттеу кестесін дайындадым</w:t>
             </w:r>
           </w:p>
         </w:tc>
@@ -1049,7 +1027,7 @@
                 <w:sz w:val="22"/>
                 <w:szCs w:val="22"/>
               </w:rPr>
-              <w:t xml:space="preserve">2-кесте, зерттеу кестесі</w:t>
+              <w:t xml:space="preserve">Зерттеу кестесі</w:t>
             </w:r>
           </w:p>
         </w:tc>
@@ -1082,9 +1060,8 @@
                 <w:bCs w:val="false"/>
                 <w:sz w:val="22"/>
                 <w:szCs w:val="22"/>
-                <w:highlight w:val="yellow"/>
-              </w:rPr>
-              <w:t xml:space="preserve">[Қиындық, өзгеріс]</w:t>
+              </w:rPr>
+              <w:t xml:space="preserve">–</w:t>
             </w:r>
           </w:p>
         </w:tc>
@@ -1190,9 +1167,8 @@
                 <w:bCs w:val="false"/>
                 <w:sz w:val="22"/>
                 <w:szCs w:val="22"/>
-                <w:highlight w:val="yellow"/>
-              </w:rPr>
-              <w:t xml:space="preserve">[күні]</w:t>
+              </w:rPr>
+              <w:t xml:space="preserve">2026 ж. қыркүйек</w:t>
             </w:r>
           </w:p>
         </w:tc>
@@ -1226,7 +1202,7 @@
                 <w:sz w:val="22"/>
                 <w:szCs w:val="22"/>
               </w:rPr>
-              <w:t xml:space="preserve">Қиял-ғажайып ертегілерді оқу</w:t>
+              <w:t xml:space="preserve">«Ер Төстік» ертегісін оқу</w:t>
             </w:r>
           </w:p>
         </w:tc>
@@ -1260,7 +1236,7 @@
                 <w:sz w:val="22"/>
                 <w:szCs w:val="22"/>
               </w:rPr>
-              <w:t xml:space="preserve">5 ертегіні оқып, әр санды кестеге жаздым, үштік құрылымды белгіледім</w:t>
+              <w:t xml:space="preserve">Ертегіні оқып, әр санды кестеге жаздым</w:t>
             </w:r>
           </w:p>
         </w:tc>
@@ -1293,19 +1269,8 @@
                 <w:bCs w:val="false"/>
                 <w:sz w:val="22"/>
                 <w:szCs w:val="22"/>
-                <w:highlight w:val="yellow"/>
-              </w:rPr>
-              <w:t xml:space="preserve">[___]</w:t>
-            </w:r>
-            <w:r>
-              <w:rPr>
-                <w:rFonts w:ascii="Times New Roman" w:cs="Times New Roman" w:eastAsia="Times New Roman" w:hAnsi="Times New Roman"/>
-                <w:b w:val="false"/>
-                <w:bCs w:val="false"/>
-                <w:sz w:val="22"/>
-                <w:szCs w:val="22"/>
-              </w:rPr>
-              <w:t xml:space="preserve"> сан</w:t>
+              </w:rPr>
+              <w:t xml:space="preserve">21 сан</w:t>
             </w:r>
           </w:p>
         </w:tc>
@@ -1338,9 +1303,8 @@
                 <w:bCs w:val="false"/>
                 <w:sz w:val="22"/>
                 <w:szCs w:val="22"/>
-                <w:highlight w:val="yellow"/>
-              </w:rPr>
-              <w:t xml:space="preserve">[Мысалы: санның нақты не символ екенін анықтау қиын болған жағдай]</w:t>
+              </w:rPr>
+              <w:t xml:space="preserve">Ең көп сан осы ертегіде болды. «Бір айда бір жастағы баладай» дегендегі «бір» сөзін сан ретінде санадым</w:t>
             </w:r>
           </w:p>
         </w:tc>
@@ -1446,9 +1410,8 @@
                 <w:bCs w:val="false"/>
                 <w:sz w:val="22"/>
                 <w:szCs w:val="22"/>
-                <w:highlight w:val="yellow"/>
-              </w:rPr>
-              <w:t xml:space="preserve">[күні]</w:t>
+              </w:rPr>
+              <w:t xml:space="preserve">2026 ж. қыркүйек</w:t>
             </w:r>
           </w:p>
         </w:tc>
@@ -1482,7 +1445,7 @@
                 <w:sz w:val="22"/>
                 <w:szCs w:val="22"/>
               </w:rPr>
-              <w:t xml:space="preserve">Хайуанаттар туралы ертегілер және аңыз-ертегі</w:t>
+              <w:t xml:space="preserve">«Керқұла атты Кендебай», «Алтын сақа» ертегілерін оқу</w:t>
             </w:r>
           </w:p>
         </w:tc>
@@ -1516,7 +1479,7 @@
                 <w:sz w:val="22"/>
                 <w:szCs w:val="22"/>
               </w:rPr>
-              <w:t xml:space="preserve">4 ертегіні оқып, сандарды кестеге жаздым</w:t>
+              <w:t xml:space="preserve">Ертегілерді сайттан және кітаптан оқып, сандарды кестеге жаздым</w:t>
             </w:r>
           </w:p>
         </w:tc>
@@ -1549,19 +1512,8 @@
                 <w:bCs w:val="false"/>
                 <w:sz w:val="22"/>
                 <w:szCs w:val="22"/>
-                <w:highlight w:val="yellow"/>
-              </w:rPr>
-              <w:t xml:space="preserve">[___]</w:t>
-            </w:r>
-            <w:r>
-              <w:rPr>
-                <w:rFonts w:ascii="Times New Roman" w:cs="Times New Roman" w:eastAsia="Times New Roman" w:hAnsi="Times New Roman"/>
-                <w:b w:val="false"/>
-                <w:bCs w:val="false"/>
-                <w:sz w:val="22"/>
-                <w:szCs w:val="22"/>
-              </w:rPr>
-              <w:t xml:space="preserve"> сан</w:t>
+              </w:rPr>
+              <w:t xml:space="preserve">18 және 7 сан</w:t>
             </w:r>
           </w:p>
         </w:tc>
@@ -1594,9 +1546,8 @@
                 <w:bCs w:val="false"/>
                 <w:sz w:val="22"/>
                 <w:szCs w:val="22"/>
-                <w:highlight w:val="yellow"/>
-              </w:rPr>
-              <w:t xml:space="preserve">[Қиындық, өзгеріс]</w:t>
+              </w:rPr>
+              <w:t xml:space="preserve">«Алты» саны жиі кездесетінін байқадым («алты айлық жол», «алты қырдың ар жағы»)</w:t>
             </w:r>
           </w:p>
         </w:tc>
@@ -1702,9 +1653,8 @@
                 <w:bCs w:val="false"/>
                 <w:sz w:val="22"/>
                 <w:szCs w:val="22"/>
-                <w:highlight w:val="yellow"/>
-              </w:rPr>
-              <w:t xml:space="preserve">[күні]</w:t>
+              </w:rPr>
+              <w:t xml:space="preserve">2026 ж. қыркүйек</w:t>
             </w:r>
           </w:p>
         </w:tc>
@@ -1738,7 +1688,7 @@
                 <w:sz w:val="22"/>
                 <w:szCs w:val="22"/>
               </w:rPr>
-              <w:t xml:space="preserve">Тұрмыс-салт ертегілерін оқу</w:t>
+              <w:t xml:space="preserve">«Күн астындағы Күнікей қыз», «Қаңбақ шал» ертегілерін оқу</w:t>
             </w:r>
           </w:p>
         </w:tc>
@@ -1772,7 +1722,7 @@
                 <w:sz w:val="22"/>
                 <w:szCs w:val="22"/>
               </w:rPr>
-              <w:t xml:space="preserve">5 ертегіні оқып, сандарды кестеге жаздым</w:t>
+              <w:t xml:space="preserve">Ертегілерді оқып, сандарды кестеге жаздым</w:t>
             </w:r>
           </w:p>
         </w:tc>
@@ -1805,19 +1755,8 @@
                 <w:bCs w:val="false"/>
                 <w:sz w:val="22"/>
                 <w:szCs w:val="22"/>
-                <w:highlight w:val="yellow"/>
-              </w:rPr>
-              <w:t xml:space="preserve">[___]</w:t>
-            </w:r>
-            <w:r>
-              <w:rPr>
-                <w:rFonts w:ascii="Times New Roman" w:cs="Times New Roman" w:eastAsia="Times New Roman" w:hAnsi="Times New Roman"/>
-                <w:b w:val="false"/>
-                <w:bCs w:val="false"/>
-                <w:sz w:val="22"/>
-                <w:szCs w:val="22"/>
-              </w:rPr>
-              <w:t xml:space="preserve"> сан</w:t>
+              </w:rPr>
+              <w:t xml:space="preserve">10 және 4 сан</w:t>
             </w:r>
           </w:p>
         </w:tc>
@@ -1850,9 +1789,8 @@
                 <w:bCs w:val="false"/>
                 <w:sz w:val="22"/>
                 <w:szCs w:val="22"/>
-                <w:highlight w:val="yellow"/>
-              </w:rPr>
-              <w:t xml:space="preserve">[Қиындық, өзгеріс]</w:t>
+              </w:rPr>
+              <w:t xml:space="preserve">«Қырық қыз», «қырық ұры», «қырық уәзір» сияқты топтарды нақты сан (Н) деп белгіледім</w:t>
             </w:r>
           </w:p>
         </w:tc>
@@ -1958,9 +1896,8 @@
                 <w:bCs w:val="false"/>
                 <w:sz w:val="22"/>
                 <w:szCs w:val="22"/>
-                <w:highlight w:val="yellow"/>
-              </w:rPr>
-              <w:t xml:space="preserve">[күні]</w:t>
+              </w:rPr>
+              <w:t xml:space="preserve">2026 ж. қыркүйек</w:t>
             </w:r>
           </w:p>
         </w:tc>
@@ -1994,7 +1931,7 @@
                 <w:sz w:val="22"/>
                 <w:szCs w:val="22"/>
               </w:rPr>
-              <w:t xml:space="preserve">Кестені тексеру</w:t>
+              <w:t xml:space="preserve">Тұрмыс-салт ертегілерін оқу</w:t>
             </w:r>
           </w:p>
         </w:tc>
@@ -2028,7 +1965,7 @@
                 <w:sz w:val="22"/>
                 <w:szCs w:val="22"/>
               </w:rPr>
-              <w:t xml:space="preserve">Күмәнді жолдарды жетекшіммен бірге қайта қарадым</w:t>
+              <w:t xml:space="preserve">«Тазшаның қырық өтірігі» мен «Аяз би» ертегілерін оқып, сандарды кестеге жаздым</w:t>
             </w:r>
           </w:p>
         </w:tc>
@@ -2062,28 +1999,7 @@
                 <w:sz w:val="22"/>
                 <w:szCs w:val="22"/>
               </w:rPr>
-              <w:t xml:space="preserve">Барлығы </w:t>
-            </w:r>
-            <w:r>
-              <w:rPr>
-                <w:rFonts w:ascii="Times New Roman" w:cs="Times New Roman" w:eastAsia="Times New Roman" w:hAnsi="Times New Roman"/>
-                <w:b w:val="false"/>
-                <w:bCs w:val="false"/>
-                <w:sz w:val="22"/>
-                <w:szCs w:val="22"/>
-                <w:highlight w:val="yellow"/>
-              </w:rPr>
-              <w:t xml:space="preserve">[___]</w:t>
-            </w:r>
-            <w:r>
-              <w:rPr>
-                <w:rFonts w:ascii="Times New Roman" w:cs="Times New Roman" w:eastAsia="Times New Roman" w:hAnsi="Times New Roman"/>
-                <w:b w:val="false"/>
-                <w:bCs w:val="false"/>
-                <w:sz w:val="22"/>
-                <w:szCs w:val="22"/>
-              </w:rPr>
-              <w:t xml:space="preserve"> сан</w:t>
+              <w:t xml:space="preserve">17 және 14 сан</w:t>
             </w:r>
           </w:p>
         </w:tc>
@@ -2116,9 +2032,8 @@
                 <w:bCs w:val="false"/>
                 <w:sz w:val="22"/>
                 <w:szCs w:val="22"/>
-                <w:highlight w:val="yellow"/>
-              </w:rPr>
-              <w:t xml:space="preserve">[Не түзетілді?]</w:t>
+              </w:rPr>
+              <w:t xml:space="preserve">Тазшаның өтіріктеріндегі сандардың бәрі әсірелеу екенін көрдім</w:t>
             </w:r>
           </w:p>
         </w:tc>
@@ -2224,9 +2139,8 @@
                 <w:bCs w:val="false"/>
                 <w:sz w:val="22"/>
                 <w:szCs w:val="22"/>
-                <w:highlight w:val="yellow"/>
-              </w:rPr>
-              <w:t xml:space="preserve">[күні]</w:t>
+              </w:rPr>
+              <w:t xml:space="preserve">2026 ж. қыркүйек</w:t>
             </w:r>
           </w:p>
         </w:tc>
@@ -2260,7 +2174,7 @@
                 <w:sz w:val="22"/>
                 <w:szCs w:val="22"/>
               </w:rPr>
-              <w:t xml:space="preserve">Нәтижелерді есептеу</w:t>
+              <w:t xml:space="preserve">Кестені тексеру</w:t>
             </w:r>
           </w:p>
         </w:tc>
@@ -2294,7 +2208,7 @@
                 <w:sz w:val="22"/>
                 <w:szCs w:val="22"/>
               </w:rPr>
-              <w:t xml:space="preserve">Әр санның жиілігін, «киелі» сандардың үлесін, Н мен Ф пайызын есептедім, диаграммалар жасадым</w:t>
+              <w:t xml:space="preserve">Кестені қайта қарап шықтым</w:t>
             </w:r>
           </w:p>
         </w:tc>
@@ -2328,7 +2242,7 @@
                 <w:sz w:val="22"/>
                 <w:szCs w:val="22"/>
               </w:rPr>
-              <w:t xml:space="preserve">3–5-кестелер, 3–4-суреттер</w:t>
+              <w:t xml:space="preserve">Барлығы 91 сан</w:t>
             </w:r>
           </w:p>
         </w:tc>
@@ -2361,9 +2275,8 @@
                 <w:bCs w:val="false"/>
                 <w:sz w:val="22"/>
                 <w:szCs w:val="22"/>
-                <w:highlight w:val="yellow"/>
-              </w:rPr>
-              <w:t xml:space="preserve">[Болжам расталды ма?]</w:t>
+              </w:rPr>
+              <w:t xml:space="preserve">Екі санның тобы түзетілді: «алты аққу» мен «отыз тоғыз ат» жануарлар тобына ауыстырылды</w:t>
             </w:r>
           </w:p>
         </w:tc>
@@ -2469,9 +2382,8 @@
                 <w:bCs w:val="false"/>
                 <w:sz w:val="22"/>
                 <w:szCs w:val="22"/>
-                <w:highlight w:val="yellow"/>
-              </w:rPr>
-              <w:t xml:space="preserve">[күні]</w:t>
+              </w:rPr>
+              <w:t xml:space="preserve">2026 ж. қазан</w:t>
             </w:r>
           </w:p>
         </w:tc>
@@ -2505,7 +2417,7 @@
                 <w:sz w:val="22"/>
                 <w:szCs w:val="22"/>
               </w:rPr>
-              <w:t xml:space="preserve">«Ертегі-есептер» жинағын жасау</w:t>
+              <w:t xml:space="preserve">Нәтижелерді есептеу</w:t>
             </w:r>
           </w:p>
         </w:tc>
@@ -2539,7 +2451,7 @@
                 <w:sz w:val="22"/>
                 <w:szCs w:val="22"/>
               </w:rPr>
-              <w:t xml:space="preserve">Ертегі сандары мен салт-дәстүрге негізделген есептер құрастырдым, жауабын өзім шығардым</w:t>
+              <w:t xml:space="preserve">Әр санның жиілігін, «киелі» сандардың үлесін, Н мен Ф пайызын есептедім, диаграммалар жасадым</w:t>
             </w:r>
           </w:p>
         </w:tc>
@@ -2573,7 +2485,7 @@
                 <w:sz w:val="22"/>
                 <w:szCs w:val="22"/>
               </w:rPr>
-              <w:t xml:space="preserve">Б қосымшасы</w:t>
+              <w:t xml:space="preserve">3–5-кестелер, 3–4-суреттер</w:t>
             </w:r>
           </w:p>
         </w:tc>
@@ -2606,9 +2518,8 @@
                 <w:bCs w:val="false"/>
                 <w:sz w:val="22"/>
                 <w:szCs w:val="22"/>
-                <w:highlight w:val="yellow"/>
-              </w:rPr>
-              <w:t xml:space="preserve">[Есептерді сыныптастарға шығартып көрдіңіз бе?]</w:t>
+              </w:rPr>
+              <w:t xml:space="preserve">«Киелі» сандар басқа сандардан символ ретінде жиірек қолданылмағанын көрдім – болжам ішінара расталды</w:t>
             </w:r>
           </w:p>
         </w:tc>
@@ -2714,9 +2625,8 @@
                 <w:bCs w:val="false"/>
                 <w:sz w:val="22"/>
                 <w:szCs w:val="22"/>
-                <w:highlight w:val="yellow"/>
-              </w:rPr>
-              <w:t xml:space="preserve">[күні]</w:t>
+              </w:rPr>
+              <w:t xml:space="preserve">2026 ж. қазан</w:t>
             </w:r>
           </w:p>
         </w:tc>
@@ -2750,7 +2660,7 @@
                 <w:sz w:val="22"/>
                 <w:szCs w:val="22"/>
               </w:rPr>
-              <w:t xml:space="preserve">Жұмысты жазу және рефлексия</w:t>
+              <w:t xml:space="preserve">«Ертегі-есептер» жинағын жасау</w:t>
             </w:r>
           </w:p>
         </w:tc>
@@ -2784,7 +2694,7 @@
                 <w:sz w:val="22"/>
                 <w:szCs w:val="22"/>
               </w:rPr>
-              <w:t xml:space="preserve">Кіріспе, бөлімдер, қорытынды және рефлексия жаздым, антиплагиаттан тексердім</w:t>
+              <w:t xml:space="preserve">Ертегі сандары мен салт-дәстүрге негізделген 10 есеп құрастырдым, жауабын өзім шығардым</w:t>
             </w:r>
           </w:p>
         </w:tc>
@@ -2818,7 +2728,7 @@
                 <w:sz w:val="22"/>
                 <w:szCs w:val="22"/>
               </w:rPr>
-              <w:t xml:space="preserve">Жұмыс мәтіні, аннотация</w:t>
+              <w:t xml:space="preserve">Б қосымшасы</w:t>
             </w:r>
           </w:p>
         </w:tc>
@@ -2851,9 +2761,8 @@
                 <w:bCs w:val="false"/>
                 <w:sz w:val="22"/>
                 <w:szCs w:val="22"/>
-                <w:highlight w:val="yellow"/>
-              </w:rPr>
-              <w:t xml:space="preserve">[Не жетілдірілді?]</w:t>
+              </w:rPr>
+              <w:t xml:space="preserve">Үш есепті өзім оқыған ертегілердегі тіркестерден құрастырдым</w:t>
             </w:r>
           </w:p>
         </w:tc>
@@ -2959,9 +2868,8 @@
                 <w:bCs w:val="false"/>
                 <w:sz w:val="22"/>
                 <w:szCs w:val="22"/>
-                <w:highlight w:val="yellow"/>
-              </w:rPr>
-              <w:t xml:space="preserve">[күні]</w:t>
+              </w:rPr>
+              <w:t xml:space="preserve">2026 ж. қазан</w:t>
             </w:r>
           </w:p>
         </w:tc>
@@ -2995,6 +2903,249 @@
                 <w:sz w:val="22"/>
                 <w:szCs w:val="22"/>
               </w:rPr>
+              <w:t xml:space="preserve">Жұмысты жазу және рефлексия</w:t>
+            </w:r>
+          </w:p>
+        </w:tc>
+        <w:tc>
+          <w:tcPr>
+            <w:tcW w:type="dxa" w:w="3642"/>
+            <w:tcBorders>
+              <w:top w:val="single" w:color="000000" w:sz="4"/>
+              <w:left w:val="single" w:color="000000" w:sz="4"/>
+              <w:bottom w:val="single" w:color="000000" w:sz="4"/>
+              <w:right w:val="single" w:color="000000" w:sz="4"/>
+            </w:tcBorders>
+            <w:tcMar>
+              <w:top w:type="dxa" w:w="40"/>
+              <w:left w:type="dxa" w:w="80"/>
+              <w:bottom w:type="dxa" w:w="40"/>
+              <w:right w:type="dxa" w:w="80"/>
+            </w:tcMar>
+            <w:vAlign w:val="center"/>
+          </w:tcPr>
+          <w:p>
+            <w:pPr>
+              <w:spacing w:line="240"/>
+              <w:jc w:val="left"/>
+            </w:pPr>
+            <w:r>
+              <w:rPr>
+                <w:rFonts w:ascii="Times New Roman" w:cs="Times New Roman" w:eastAsia="Times New Roman" w:hAnsi="Times New Roman"/>
+                <w:b w:val="false"/>
+                <w:bCs w:val="false"/>
+                <w:sz w:val="22"/>
+                <w:szCs w:val="22"/>
+              </w:rPr>
+              <w:t xml:space="preserve">Кіріспе, бөлімдер, қорытынды және рефлексия жаздым, антиплагиаттан тексердім</w:t>
+            </w:r>
+          </w:p>
+        </w:tc>
+        <w:tc>
+          <w:tcPr>
+            <w:tcW w:type="dxa" w:w="3059"/>
+            <w:tcBorders>
+              <w:top w:val="single" w:color="000000" w:sz="4"/>
+              <w:left w:val="single" w:color="000000" w:sz="4"/>
+              <w:bottom w:val="single" w:color="000000" w:sz="4"/>
+              <w:right w:val="single" w:color="000000" w:sz="4"/>
+            </w:tcBorders>
+            <w:tcMar>
+              <w:top w:type="dxa" w:w="40"/>
+              <w:left w:type="dxa" w:w="80"/>
+              <w:bottom w:type="dxa" w:w="40"/>
+              <w:right w:type="dxa" w:w="80"/>
+            </w:tcMar>
+            <w:vAlign w:val="center"/>
+          </w:tcPr>
+          <w:p>
+            <w:pPr>
+              <w:spacing w:line="240"/>
+              <w:jc w:val="left"/>
+            </w:pPr>
+            <w:r>
+              <w:rPr>
+                <w:rFonts w:ascii="Times New Roman" w:cs="Times New Roman" w:eastAsia="Times New Roman" w:hAnsi="Times New Roman"/>
+                <w:b w:val="false"/>
+                <w:bCs w:val="false"/>
+                <w:sz w:val="22"/>
+                <w:szCs w:val="22"/>
+              </w:rPr>
+              <w:t xml:space="preserve">Жұмыс мәтіні, аннотация</w:t>
+            </w:r>
+          </w:p>
+        </w:tc>
+        <w:tc>
+          <w:tcPr>
+            <w:tcW w:type="dxa" w:w="2622"/>
+            <w:tcBorders>
+              <w:top w:val="single" w:color="000000" w:sz="4"/>
+              <w:left w:val="single" w:color="000000" w:sz="4"/>
+              <w:bottom w:val="single" w:color="000000" w:sz="4"/>
+              <w:right w:val="single" w:color="000000" w:sz="4"/>
+            </w:tcBorders>
+            <w:tcMar>
+              <w:top w:type="dxa" w:w="40"/>
+              <w:left w:type="dxa" w:w="80"/>
+              <w:bottom w:type="dxa" w:w="40"/>
+              <w:right w:type="dxa" w:w="80"/>
+            </w:tcMar>
+            <w:vAlign w:val="center"/>
+          </w:tcPr>
+          <w:p>
+            <w:pPr>
+              <w:spacing w:line="240"/>
+              <w:jc w:val="left"/>
+            </w:pPr>
+            <w:r>
+              <w:rPr>
+                <w:rFonts w:ascii="Times New Roman" w:cs="Times New Roman" w:eastAsia="Times New Roman" w:hAnsi="Times New Roman"/>
+                <w:b w:val="false"/>
+                <w:bCs w:val="false"/>
+                <w:sz w:val="22"/>
+                <w:szCs w:val="22"/>
+              </w:rPr>
+              <w:t xml:space="preserve">–</w:t>
+            </w:r>
+          </w:p>
+        </w:tc>
+        <w:tc>
+          <w:tcPr>
+            <w:tcW w:type="dxa" w:w="878"/>
+            <w:tcBorders>
+              <w:top w:val="single" w:color="000000" w:sz="4"/>
+              <w:left w:val="single" w:color="000000" w:sz="4"/>
+              <w:bottom w:val="single" w:color="000000" w:sz="4"/>
+              <w:right w:val="single" w:color="000000" w:sz="4"/>
+            </w:tcBorders>
+            <w:tcMar>
+              <w:top w:type="dxa" w:w="40"/>
+              <w:left w:type="dxa" w:w="80"/>
+              <w:bottom w:type="dxa" w:w="40"/>
+              <w:right w:type="dxa" w:w="80"/>
+            </w:tcMar>
+            <w:vAlign w:val="center"/>
+          </w:tcPr>
+          <w:p>
+            <w:pPr>
+              <w:spacing w:line="240"/>
+              <w:jc w:val="center"/>
+            </w:pPr>
+            <w:r>
+              <w:rPr>
+                <w:rFonts w:ascii="Times New Roman" w:cs="Times New Roman" w:eastAsia="Times New Roman" w:hAnsi="Times New Roman"/>
+                <w:b w:val="false"/>
+                <w:bCs w:val="false"/>
+                <w:sz w:val="22"/>
+                <w:szCs w:val="22"/>
+              </w:rPr>
+              <w:t xml:space="preserve">–</w:t>
+            </w:r>
+          </w:p>
+        </w:tc>
+      </w:tr>
+      <w:tr>
+        <w:trPr>
+          <w:cantSplit/>
+        </w:trPr>
+        <w:tc>
+          <w:tcPr>
+            <w:tcW w:type="dxa" w:w="582"/>
+            <w:tcBorders>
+              <w:top w:val="single" w:color="000000" w:sz="4"/>
+              <w:left w:val="single" w:color="000000" w:sz="4"/>
+              <w:bottom w:val="single" w:color="000000" w:sz="4"/>
+              <w:right w:val="single" w:color="000000" w:sz="4"/>
+            </w:tcBorders>
+            <w:tcMar>
+              <w:top w:type="dxa" w:w="40"/>
+              <w:left w:type="dxa" w:w="80"/>
+              <w:bottom w:type="dxa" w:w="40"/>
+              <w:right w:type="dxa" w:w="80"/>
+            </w:tcMar>
+            <w:vAlign w:val="center"/>
+          </w:tcPr>
+          <w:p>
+            <w:pPr>
+              <w:spacing w:line="240"/>
+              <w:jc w:val="center"/>
+            </w:pPr>
+            <w:r>
+              <w:rPr>
+                <w:rFonts w:ascii="Times New Roman" w:cs="Times New Roman" w:eastAsia="Times New Roman" w:hAnsi="Times New Roman"/>
+                <w:b w:val="false"/>
+                <w:bCs w:val="false"/>
+                <w:sz w:val="22"/>
+                <w:szCs w:val="22"/>
+              </w:rPr>
+              <w:t xml:space="preserve">12</w:t>
+            </w:r>
+          </w:p>
+        </w:tc>
+        <w:tc>
+          <w:tcPr>
+            <w:tcW w:type="dxa" w:w="1311"/>
+            <w:tcBorders>
+              <w:top w:val="single" w:color="000000" w:sz="4"/>
+              <w:left w:val="single" w:color="000000" w:sz="4"/>
+              <w:bottom w:val="single" w:color="000000" w:sz="4"/>
+              <w:right w:val="single" w:color="000000" w:sz="4"/>
+            </w:tcBorders>
+            <w:tcMar>
+              <w:top w:type="dxa" w:w="40"/>
+              <w:left w:type="dxa" w:w="80"/>
+              <w:bottom w:type="dxa" w:w="40"/>
+              <w:right w:type="dxa" w:w="80"/>
+            </w:tcMar>
+            <w:vAlign w:val="center"/>
+          </w:tcPr>
+          <w:p>
+            <w:pPr>
+              <w:spacing w:line="240"/>
+              <w:jc w:val="left"/>
+            </w:pPr>
+            <w:r>
+              <w:rPr>
+                <w:rFonts w:ascii="Times New Roman" w:cs="Times New Roman" w:eastAsia="Times New Roman" w:hAnsi="Times New Roman"/>
+                <w:b w:val="false"/>
+                <w:bCs w:val="false"/>
+                <w:sz w:val="22"/>
+                <w:szCs w:val="22"/>
+              </w:rPr>
+              <w:t xml:space="preserve">2026 ж. қазан</w:t>
+            </w:r>
+          </w:p>
+        </w:tc>
+        <w:tc>
+          <w:tcPr>
+            <w:tcW w:type="dxa" w:w="2476"/>
+            <w:tcBorders>
+              <w:top w:val="single" w:color="000000" w:sz="4"/>
+              <w:left w:val="single" w:color="000000" w:sz="4"/>
+              <w:bottom w:val="single" w:color="000000" w:sz="4"/>
+              <w:right w:val="single" w:color="000000" w:sz="4"/>
+            </w:tcBorders>
+            <w:tcMar>
+              <w:top w:type="dxa" w:w="40"/>
+              <w:left w:type="dxa" w:w="80"/>
+              <w:bottom w:type="dxa" w:w="40"/>
+              <w:right w:type="dxa" w:w="80"/>
+            </w:tcMar>
+            <w:vAlign w:val="center"/>
+          </w:tcPr>
+          <w:p>
+            <w:pPr>
+              <w:spacing w:line="240"/>
+              <w:jc w:val="left"/>
+            </w:pPr>
+            <w:r>
+              <w:rPr>
+                <w:rFonts w:ascii="Times New Roman" w:cs="Times New Roman" w:eastAsia="Times New Roman" w:hAnsi="Times New Roman"/>
+                <w:b w:val="false"/>
+                <w:bCs w:val="false"/>
+                <w:sz w:val="22"/>
+                <w:szCs w:val="22"/>
+              </w:rPr>
               <w:t xml:space="preserve">Қорғауға дайындық</w:t>
             </w:r>
           </w:p>
@@ -3096,9 +3247,8 @@
                 <w:bCs w:val="false"/>
                 <w:sz w:val="22"/>
                 <w:szCs w:val="22"/>
-                <w:highlight w:val="yellow"/>
-              </w:rPr>
-              <w:t xml:space="preserve">[Қиындықтар]</w:t>
+              </w:rPr>
+              <w:t xml:space="preserve">–</w:t>
             </w:r>
           </w:p>
         </w:tc>

</xml_diff>